<commit_message>
Fix D10 LCSC part number (C94085 -> C2491 MB10F) and add JLCPCB BOM CSV
</commit_message>
<xml_diff>
--- a/SprinKlr8_PCB_Design_Guide.docx
+++ b/SprinKlr8_PCB_Design_Guide.docx
@@ -1662,7 +1662,7 @@
               </w:rPr>
               <w:t>MB10F bridge rectifier SOP-4</w:t>
               <w:br/>
-              <w:t>LCSC C94085</w:t>
+              <w:t>LCSC C2491</w:t>
             </w:r>
           </w:p>
         </w:tc>
@@ -7113,7 +7113,7 @@
               <w:rPr>
                 <w:sz w:val="18"/>
               </w:rPr>
-              <w:t>C94085</w:t>
+              <w:t>C2491</w:t>
             </w:r>
           </w:p>
         </w:tc>

</xml_diff>

<commit_message>
C2: switch to in-stock equivalent (KNSCHA XT220UF25V90RV0075, C2992606)
Same 220uF 25V D6.3xL7.7mm SMD package; C4747974 was out of stock.
</commit_message>
<xml_diff>
--- a/SprinKlr8_PCB_Design_Guide.docx
+++ b/SprinKlr8_PCB_Design_Guide.docx
@@ -3872,7 +3872,7 @@
               </w:rPr>
               <w:t>220uF 10V electrolytic SMD</w:t>
               <w:br/>
-              <w:t>LCSC C4747974</w:t>
+              <w:t>LCSC C2992606</w:t>
             </w:r>
           </w:p>
         </w:tc>
@@ -11972,7 +11972,7 @@
           </w:tcPr>
           <w:p>
             <w:r>
-              <w:t>C4747974</w:t>
+              <w:t>C2992606</w:t>
             </w:r>
           </w:p>
         </w:tc>

</xml_diff>

<commit_message>
D12: fix SS14 part number and footprint (C2837435 invalid -> C2480, SOD-123 -> SMA)
SS14 1A 40V Schottky is in SMA (DO-214AC) package, not SOD-123.
C2480 is the JLCPCB basic-part SS14.
</commit_message>
<xml_diff>
--- a/SprinKlr8_PCB_Design_Guide.docx
+++ b/SprinKlr8_PCB_Design_Guide.docx
@@ -4378,9 +4378,9 @@
                 <w:szCs w:val="22"/>
                 <w:lang w:val="en-US" w:eastAsia="en-US" w:bidi="ar-SA"/>
               </w:rPr>
-              <w:t>SS14 Schottky SOD-123</w:t>
+              <w:t>SS14 Schottky SMA</w:t>
               <w:br/>
-              <w:t>LCSC C2837435</w:t>
+              <w:t>LCSC C2480</w:t>
             </w:r>
           </w:p>
         </w:tc>
@@ -12024,7 +12024,7 @@
           </w:tcPr>
           <w:p>
             <w:r>
-              <w:t>C2837435</w:t>
+              <w:t>C2480</w:t>
             </w:r>
           </w:p>
         </w:tc>

</xml_diff>